<commit_message>
Replace zero leakage table with cleanup audit
</commit_message>
<xml_diff>
--- a/reports/documents/Final_Report_IEEE_G11_Multimodal_Fake_News.docx
+++ b/reports/documents/Final_Report_IEEE_G11_Multimodal_Fake_News.docx
@@ -792,7 +792,7 @@
           <w:i w:val="0"/>
           <w:sz w:val="16"/>
         </w:rPr>
-        <w:t>TABLE II. IMAGE-CONTENT LEAKAGE AUDIT AFTER CLEANING</w:t>
+        <w:t>TABLE II. IMAGE-CONTENT LEAKAGE FOUND BEFORE DE-LEAKING</w:t>
       </w:r>
     </w:p>
     <w:tbl>
@@ -905,7 +905,7 @@
                 <w:i w:val="0"/>
                 <w:sz w:val="13"/>
               </w:rPr>
-              <w:t>0</w:t>
+              <w:t>22</w:t>
             </w:r>
           </w:p>
         </w:tc>
@@ -925,7 +925,7 @@
                 <w:i w:val="0"/>
                 <w:sz w:val="13"/>
               </w:rPr>
-              <w:t>0.0000</w:t>
+              <w:t>4.0970</w:t>
             </w:r>
           </w:p>
         </w:tc>
@@ -967,7 +967,7 @@
                 <w:i w:val="0"/>
                 <w:sz w:val="13"/>
               </w:rPr>
-              <w:t>0</w:t>
+              <w:t>13</w:t>
             </w:r>
           </w:p>
         </w:tc>
@@ -987,7 +987,7 @@
                 <w:i w:val="0"/>
                 <w:sz w:val="13"/>
               </w:rPr>
-              <w:t>0.0000</w:t>
+              <w:t>2.5540</w:t>
             </w:r>
           </w:p>
         </w:tc>
@@ -1029,7 +1029,7 @@
                 <w:i w:val="0"/>
                 <w:sz w:val="13"/>
               </w:rPr>
-              <w:t>0</w:t>
+              <w:t>6</w:t>
             </w:r>
           </w:p>
         </w:tc>
@@ -1049,7 +1049,7 @@
                 <w:i w:val="0"/>
                 <w:sz w:val="13"/>
               </w:rPr>
-              <w:t>0.0000</w:t>
+              <w:t>1.1790</w:t>
             </w:r>
           </w:p>
         </w:tc>
@@ -1067,7 +1067,377 @@
           <w:i w:val="0"/>
           <w:sz w:val="16"/>
         </w:rPr>
-        <w:t>TABLE III. CONTENT/TITLE MODELING SPLIT FOLDERS</w:t>
+        <w:t>TABLE III. ROWS REMOVED TO FIX PRIOR-SPLIT IMAGE OVERLAP</w:t>
+      </w:r>
+    </w:p>
+    <w:tbl>
+      <w:tblPr>
+        <w:tblStyle w:val="TableGrid"/>
+        <w:tblW w:type="auto" w:w="0"/>
+        <w:tblLook w:firstColumn="1" w:firstRow="1" w:lastColumn="0" w:lastRow="0" w:noHBand="0" w:noVBand="1" w:val="04A0"/>
+      </w:tblPr>
+      <w:tblGrid>
+        <w:gridCol w:w="2592"/>
+        <w:gridCol w:w="2592"/>
+        <w:gridCol w:w="2592"/>
+        <w:gridCol w:w="2592"/>
+      </w:tblGrid>
+      <w:tr>
+        <w:tc>
+          <w:tcPr>
+            <w:tcW w:type="dxa" w:w="2592"/>
+          </w:tcPr>
+          <w:p>
+            <w:pPr>
+              <w:spacing w:after="0"/>
+            </w:pPr>
+            <w:r/>
+            <w:r>
+              <w:rPr>
+                <w:rFonts w:ascii="Times New Roman" w:hAnsi="Times New Roman" w:eastAsia="Times New Roman"/>
+                <w:b/>
+                <w:i w:val="0"/>
+                <w:sz w:val="13"/>
+              </w:rPr>
+              <w:t>split</w:t>
+            </w:r>
+          </w:p>
+        </w:tc>
+        <w:tc>
+          <w:tcPr>
+            <w:tcW w:type="dxa" w:w="2592"/>
+          </w:tcPr>
+          <w:p>
+            <w:pPr>
+              <w:spacing w:after="0"/>
+            </w:pPr>
+            <w:r/>
+            <w:r>
+              <w:rPr>
+                <w:rFonts w:ascii="Times New Roman" w:hAnsi="Times New Roman" w:eastAsia="Times New Roman"/>
+                <w:b/>
+                <w:i w:val="0"/>
+                <w:sz w:val="13"/>
+              </w:rPr>
+              <w:t>rows_before</w:t>
+            </w:r>
+          </w:p>
+        </w:tc>
+        <w:tc>
+          <w:tcPr>
+            <w:tcW w:type="dxa" w:w="2592"/>
+          </w:tcPr>
+          <w:p>
+            <w:pPr>
+              <w:spacing w:after="0"/>
+            </w:pPr>
+            <w:r/>
+            <w:r>
+              <w:rPr>
+                <w:rFonts w:ascii="Times New Roman" w:hAnsi="Times New Roman" w:eastAsia="Times New Roman"/>
+                <w:b/>
+                <w:i w:val="0"/>
+                <w:sz w:val="13"/>
+              </w:rPr>
+              <w:t>rows_after</w:t>
+            </w:r>
+          </w:p>
+        </w:tc>
+        <w:tc>
+          <w:tcPr>
+            <w:tcW w:type="dxa" w:w="2592"/>
+          </w:tcPr>
+          <w:p>
+            <w:pPr>
+              <w:spacing w:after="0"/>
+            </w:pPr>
+            <w:r/>
+            <w:r>
+              <w:rPr>
+                <w:rFonts w:ascii="Times New Roman" w:hAnsi="Times New Roman" w:eastAsia="Times New Roman"/>
+                <w:b/>
+                <w:i w:val="0"/>
+                <w:sz w:val="13"/>
+              </w:rPr>
+              <w:t>rows_removed_for_prior_split_image_overlap</w:t>
+            </w:r>
+          </w:p>
+        </w:tc>
+      </w:tr>
+      <w:tr>
+        <w:tc>
+          <w:tcPr>
+            <w:tcW w:type="dxa" w:w="2592"/>
+          </w:tcPr>
+          <w:p>
+            <w:pPr>
+              <w:spacing w:after="0"/>
+            </w:pPr>
+            <w:r/>
+            <w:r>
+              <w:rPr>
+                <w:rFonts w:ascii="Times New Roman" w:hAnsi="Times New Roman" w:eastAsia="Times New Roman"/>
+                <w:b w:val="0"/>
+                <w:i w:val="0"/>
+                <w:sz w:val="13"/>
+              </w:rPr>
+              <w:t>train</w:t>
+            </w:r>
+          </w:p>
+        </w:tc>
+        <w:tc>
+          <w:tcPr>
+            <w:tcW w:type="dxa" w:w="2592"/>
+          </w:tcPr>
+          <w:p>
+            <w:pPr>
+              <w:spacing w:after="0"/>
+            </w:pPr>
+            <w:r/>
+            <w:r>
+              <w:rPr>
+                <w:rFonts w:ascii="Times New Roman" w:hAnsi="Times New Roman" w:eastAsia="Times New Roman"/>
+                <w:b w:val="0"/>
+                <w:i w:val="0"/>
+                <w:sz w:val="13"/>
+              </w:rPr>
+              <w:t>4553</w:t>
+            </w:r>
+          </w:p>
+        </w:tc>
+        <w:tc>
+          <w:tcPr>
+            <w:tcW w:type="dxa" w:w="2592"/>
+          </w:tcPr>
+          <w:p>
+            <w:pPr>
+              <w:spacing w:after="0"/>
+            </w:pPr>
+            <w:r/>
+            <w:r>
+              <w:rPr>
+                <w:rFonts w:ascii="Times New Roman" w:hAnsi="Times New Roman" w:eastAsia="Times New Roman"/>
+                <w:b w:val="0"/>
+                <w:i w:val="0"/>
+                <w:sz w:val="13"/>
+              </w:rPr>
+              <w:t>4553</w:t>
+            </w:r>
+          </w:p>
+        </w:tc>
+        <w:tc>
+          <w:tcPr>
+            <w:tcW w:type="dxa" w:w="2592"/>
+          </w:tcPr>
+          <w:p>
+            <w:pPr>
+              <w:spacing w:after="0"/>
+            </w:pPr>
+            <w:r/>
+            <w:r>
+              <w:rPr>
+                <w:rFonts w:ascii="Times New Roman" w:hAnsi="Times New Roman" w:eastAsia="Times New Roman"/>
+                <w:b w:val="0"/>
+                <w:i w:val="0"/>
+                <w:sz w:val="13"/>
+              </w:rPr>
+              <w:t>0</w:t>
+            </w:r>
+          </w:p>
+        </w:tc>
+      </w:tr>
+      <w:tr>
+        <w:tc>
+          <w:tcPr>
+            <w:tcW w:type="dxa" w:w="2592"/>
+          </w:tcPr>
+          <w:p>
+            <w:pPr>
+              <w:spacing w:after="0"/>
+            </w:pPr>
+            <w:r/>
+            <w:r>
+              <w:rPr>
+                <w:rFonts w:ascii="Times New Roman" w:hAnsi="Times New Roman" w:eastAsia="Times New Roman"/>
+                <w:b w:val="0"/>
+                <w:i w:val="0"/>
+                <w:sz w:val="13"/>
+              </w:rPr>
+              <w:t>val</w:t>
+            </w:r>
+          </w:p>
+        </w:tc>
+        <w:tc>
+          <w:tcPr>
+            <w:tcW w:type="dxa" w:w="2592"/>
+          </w:tcPr>
+          <w:p>
+            <w:pPr>
+              <w:spacing w:after="0"/>
+            </w:pPr>
+            <w:r/>
+            <w:r>
+              <w:rPr>
+                <w:rFonts w:ascii="Times New Roman" w:hAnsi="Times New Roman" w:eastAsia="Times New Roman"/>
+                <w:b w:val="0"/>
+                <w:i w:val="0"/>
+                <w:sz w:val="13"/>
+              </w:rPr>
+              <w:t>540</w:t>
+            </w:r>
+          </w:p>
+        </w:tc>
+        <w:tc>
+          <w:tcPr>
+            <w:tcW w:type="dxa" w:w="2592"/>
+          </w:tcPr>
+          <w:p>
+            <w:pPr>
+              <w:spacing w:after="0"/>
+            </w:pPr>
+            <w:r/>
+            <w:r>
+              <w:rPr>
+                <w:rFonts w:ascii="Times New Roman" w:hAnsi="Times New Roman" w:eastAsia="Times New Roman"/>
+                <w:b w:val="0"/>
+                <w:i w:val="0"/>
+                <w:sz w:val="13"/>
+              </w:rPr>
+              <w:t>515</w:t>
+            </w:r>
+          </w:p>
+        </w:tc>
+        <w:tc>
+          <w:tcPr>
+            <w:tcW w:type="dxa" w:w="2592"/>
+          </w:tcPr>
+          <w:p>
+            <w:pPr>
+              <w:spacing w:after="0"/>
+            </w:pPr>
+            <w:r/>
+            <w:r>
+              <w:rPr>
+                <w:rFonts w:ascii="Times New Roman" w:hAnsi="Times New Roman" w:eastAsia="Times New Roman"/>
+                <w:b w:val="0"/>
+                <w:i w:val="0"/>
+                <w:sz w:val="13"/>
+              </w:rPr>
+              <w:t>25</w:t>
+            </w:r>
+          </w:p>
+        </w:tc>
+      </w:tr>
+      <w:tr>
+        <w:tc>
+          <w:tcPr>
+            <w:tcW w:type="dxa" w:w="2592"/>
+          </w:tcPr>
+          <w:p>
+            <w:pPr>
+              <w:spacing w:after="0"/>
+            </w:pPr>
+            <w:r/>
+            <w:r>
+              <w:rPr>
+                <w:rFonts w:ascii="Times New Roman" w:hAnsi="Times New Roman" w:eastAsia="Times New Roman"/>
+                <w:b w:val="0"/>
+                <w:i w:val="0"/>
+                <w:sz w:val="13"/>
+              </w:rPr>
+              <w:t>test</w:t>
+            </w:r>
+          </w:p>
+        </w:tc>
+        <w:tc>
+          <w:tcPr>
+            <w:tcW w:type="dxa" w:w="2592"/>
+          </w:tcPr>
+          <w:p>
+            <w:pPr>
+              <w:spacing w:after="0"/>
+            </w:pPr>
+            <w:r/>
+            <w:r>
+              <w:rPr>
+                <w:rFonts w:ascii="Times New Roman" w:hAnsi="Times New Roman" w:eastAsia="Times New Roman"/>
+                <w:b w:val="0"/>
+                <w:i w:val="0"/>
+                <w:sz w:val="13"/>
+              </w:rPr>
+              <w:t>514</w:t>
+            </w:r>
+          </w:p>
+        </w:tc>
+        <w:tc>
+          <w:tcPr>
+            <w:tcW w:type="dxa" w:w="2592"/>
+          </w:tcPr>
+          <w:p>
+            <w:pPr>
+              <w:spacing w:after="0"/>
+            </w:pPr>
+            <w:r/>
+            <w:r>
+              <w:rPr>
+                <w:rFonts w:ascii="Times New Roman" w:hAnsi="Times New Roman" w:eastAsia="Times New Roman"/>
+                <w:b w:val="0"/>
+                <w:i w:val="0"/>
+                <w:sz w:val="13"/>
+              </w:rPr>
+              <w:t>492</w:t>
+            </w:r>
+          </w:p>
+        </w:tc>
+        <w:tc>
+          <w:tcPr>
+            <w:tcW w:type="dxa" w:w="2592"/>
+          </w:tcPr>
+          <w:p>
+            <w:pPr>
+              <w:spacing w:after="0"/>
+            </w:pPr>
+            <w:r/>
+            <w:r>
+              <w:rPr>
+                <w:rFonts w:ascii="Times New Roman" w:hAnsi="Times New Roman" w:eastAsia="Times New Roman"/>
+                <w:b w:val="0"/>
+                <w:i w:val="0"/>
+                <w:sz w:val="13"/>
+              </w:rPr>
+              <w:t>22</w:t>
+            </w:r>
+          </w:p>
+        </w:tc>
+      </w:tr>
+    </w:tbl>
+    <w:p/>
+    <w:p>
+      <w:pPr>
+        <w:spacing w:after="60" w:line="240" w:lineRule="auto"/>
+      </w:pPr>
+      <w:r>
+        <w:rPr>
+          <w:rFonts w:ascii="Times New Roman" w:hAnsi="Times New Roman" w:eastAsia="Times New Roman"/>
+          <w:b w:val="0"/>
+          <w:i w:val="0"/>
+          <w:sz w:val="18"/>
+        </w:rPr>
+        <w:t>After this de-leaking step, the final SHA-256 image-content audit reported zero train-validation, train-test, and validation-test image-hash overlap. In the report, this final all-clear result is stated in text instead of shown as a zero-filled table.</w:t>
+      </w:r>
+    </w:p>
+    <w:p>
+      <w:pPr>
+        <w:jc w:val="center"/>
+      </w:pPr>
+      <w:r>
+        <w:rPr>
+          <w:rFonts w:ascii="Times New Roman" w:hAnsi="Times New Roman" w:eastAsia="Times New Roman"/>
+          <w:b/>
+          <w:i w:val="0"/>
+          <w:sz w:val="16"/>
+        </w:rPr>
+        <w:t>TABLE IV. CONTENT/TITLE MODELING SPLIT FOLDERS</w:t>
       </w:r>
     </w:p>
     <w:tbl>
@@ -2491,7 +2861,7 @@
           <w:i w:val="0"/>
           <w:sz w:val="16"/>
         </w:rPr>
-        <w:t>TABLE IV. FAIR VALID-IMAGE TEST RESULTS</w:t>
+        <w:t>TABLE V. FAIR VALID-IMAGE TEST RESULTS</w:t>
       </w:r>
     </w:p>
     <w:tbl>
@@ -3863,7 +4233,7 @@
           <w:i w:val="0"/>
           <w:sz w:val="16"/>
         </w:rPr>
-        <w:t>TABLE V. DEEP ABLATION MEAN AND STANDARD DEVIATION ACROSS SEEDS</w:t>
+        <w:t>TABLE VI. DEEP ABLATION MEAN AND STANDARD DEVIATION ACROSS SEEDS</w:t>
       </w:r>
     </w:p>
     <w:tbl>
@@ -4469,7 +4839,7 @@
           <w:i w:val="0"/>
           <w:sz w:val="16"/>
         </w:rPr>
-        <w:t>TABLE VI. BOOTSTRAPPED MACRO-F1 CONFIDENCE INTERVALS</w:t>
+        <w:t>TABLE VII. BOOTSTRAPPED MACRO-F1 CONFIDENCE INTERVALS</w:t>
       </w:r>
     </w:p>
     <w:tbl>
@@ -5235,7 +5605,7 @@
           <w:i w:val="0"/>
           <w:sz w:val="16"/>
         </w:rPr>
-        <w:t>TABLE VII. MCNEMAR TESTS AGAINST TEXT-ONLY BASELINE</w:t>
+        <w:t>TABLE VIII. MCNEMAR TESTS AGAINST TEXT-ONLY BASELINE</w:t>
       </w:r>
     </w:p>
     <w:tbl>
@@ -6044,7 +6414,7 @@
           <w:i w:val="0"/>
           <w:sz w:val="16"/>
         </w:rPr>
-        <w:t>TABLE VIII. MANUAL VALIDITY AND HARD-SAMPLE CLEANING AUDIT</w:t>
+        <w:t>TABLE IX. MANUAL VALIDITY AND HARD-SAMPLE CLEANING AUDIT</w:t>
       </w:r>
     </w:p>
     <w:tbl>
@@ -6448,7 +6818,7 @@
           <w:i w:val="0"/>
           <w:sz w:val="16"/>
         </w:rPr>
-        <w:t>TABLE IX. BEFORE/AFTER CLEANING MACRO-F1 CHANGE</w:t>
+        <w:t>TABLE X. BEFORE/AFTER CLEANING MACRO-F1 CHANGE</w:t>
       </w:r>
     </w:p>
     <w:tbl>
@@ -6982,7 +7352,7 @@
           <w:i w:val="0"/>
           <w:sz w:val="16"/>
         </w:rPr>
-        <w:t>TABLE X. DIAGNOSTIC NORMAL-SPLIT RESULTS ORDERED BY MACRO-F1</w:t>
+        <w:t>TABLE XI. DIAGNOSTIC NORMAL-SPLIT RESULTS ORDERED BY MACRO-F1</w:t>
       </w:r>
     </w:p>
     <w:tbl>
@@ -9047,7 +9417,7 @@
           <w:i w:val="0"/>
           <w:sz w:val="16"/>
         </w:rPr>
-        <w:t>TABLE XI. CLIP IMAGE-TEXT CONSISTENCY ANALYSIS</w:t>
+        <w:t>TABLE XII. CLIP IMAGE-TEXT CONSISTENCY ANALYSIS</w:t>
       </w:r>
     </w:p>
     <w:tbl>
@@ -10011,7 +10381,7 @@
           <w:i w:val="0"/>
           <w:sz w:val="16"/>
         </w:rPr>
-        <w:t>TABLE XII. FAILURE-CASE CATEGORY SUMMARY</w:t>
+        <w:t>TABLE XIII. FAILURE-CASE CATEGORY SUMMARY</w:t>
       </w:r>
     </w:p>
     <w:tbl>
@@ -10163,7 +10533,7 @@
           <w:i w:val="0"/>
           <w:sz w:val="16"/>
         </w:rPr>
-        <w:t>TABLE XIII. PER-SOURCE TEXT BASELINE DIAGNOSTIC METRICS</w:t>
+        <w:t>TABLE XIV. PER-SOURCE TEXT BASELINE DIAGNOSTIC METRICS</w:t>
       </w:r>
     </w:p>
     <w:tbl>
@@ -10827,7 +11197,7 @@
           <w:i w:val="0"/>
           <w:sz w:val="16"/>
         </w:rPr>
-        <w:t>TABLE XIV. MODEL FAMILY SUMMARY FOR DIAGNOSTIC RUNS</w:t>
+        <w:t>TABLE XV. MODEL FAMILY SUMMARY FOR DIAGNOSTIC RUNS</w:t>
       </w:r>
     </w:p>
     <w:tbl>
@@ -12719,7 +13089,7 @@
           <w:i w:val="0"/>
           <w:sz w:val="16"/>
         </w:rPr>
-        <w:t>TABLE XV. FINAL TIMELINE WITH STUDENT ASSIGNMENTS</w:t>
+        <w:t>TABLE XVI. FINAL TIMELINE WITH STUDENT ASSIGNMENTS</w:t>
       </w:r>
     </w:p>
     <w:tbl>

</xml_diff>